<commit_message>
Re-render Program 1 workbook and facilitator guide
</commit_message>
<xml_diff>
--- a/institutional/correctional/banking-credit/print/facilitator-guide.docx
+++ b/institutional/correctional/banking-credit/print/facilitator-guide.docx
@@ -56,184 +56,271 @@
     </w:p>
     <w:p>
       <w:pPr>
+        <w:pStyle w:val="Date"/>
+      </w:pPr>
+      <w:r>
+        <w:t xml:space="preserve">Financially</w:t>
+      </w:r>
+      <w:r>
+        <w:t xml:space="preserve"> </w:t>
+      </w:r>
+      <w:r>
+        <w:t xml:space="preserve">Sovereign</w:t>
+      </w:r>
+      <w:r>
+        <w:t xml:space="preserve"> </w:t>
+      </w:r>
+      <w:r>
+        <w:t xml:space="preserve">Academy</w:t>
+      </w:r>
+    </w:p>
+    <w:p>
+      <w:pPr>
+        <w:pStyle w:val="Heading1"/>
+      </w:pPr>
+      <w:bookmarkStart w:id="20" w:name="about-this-guide"/>
+      <w:r>
+        <w:t xml:space="preserve">About this guide</w:t>
+      </w:r>
+      <w:bookmarkEnd w:id="20"/>
+    </w:p>
+    <w:p>
+      <w:pPr>
         <w:pStyle w:val="FirstParagraph"/>
       </w:pPr>
       <w:r>
-        <w:t xml:space="preserve">Banking and Credit Rebuilding (6 weeks)</w:t>
-      </w:r>
-    </w:p>
-    <w:p>
-      <w:pPr>
-        <w:pStyle w:val="BodyText"/>
-      </w:pPr>
-      <w:r>
-        <w:t xml:space="preserve">Financially Sovereign Academy</w:t>
+        <w:t xml:space="preserve">This guide helps you run the 6-week Banking and Credit Rebuilding program. You do not need to be a finance expert. You need to be prepared, honest, and respectful. The class is education, not financial, legal, or tax advice. Say that out loud in week one and any time someone asks for personal advice.</w:t>
+      </w:r>
+    </w:p>
+    <w:p>
+      <w:pPr>
+        <w:pStyle w:val="BodyText"/>
+      </w:pPr>
+      <w:r>
+        <w:t xml:space="preserve">This program is built from existing Financially Sovereign Academy lessons, adapted for returning citizens. Each week notes the source material so you can go deeper if you want.</w:t>
+      </w:r>
+    </w:p>
+    <w:p>
+      <w:pPr>
+        <w:pStyle w:val="BodyText"/>
+      </w:pPr>
+      <w:r>
+        <w:rPr>
+          <w:b/>
+        </w:rPr>
+        <w:t xml:space="preserve">Who should facilitate.</w:t>
+      </w:r>
+      <w:r>
+        <w:t xml:space="preserve"> </w:t>
+      </w:r>
+      <w:r>
+        <w:t xml:space="preserve">Ideally two people: one facilitator and one co-facilitator with lived reentry experience. Peer credibility helps people trust the room. (This is our working assumption, supported in general reentry practice.)</w:t>
+      </w:r>
+    </w:p>
+    <w:p>
+      <w:pPr>
+        <w:pStyle w:val="BodyText"/>
+      </w:pPr>
+      <w:r>
+        <w:rPr>
+          <w:b/>
+        </w:rPr>
+        <w:t xml:space="preserve">The room rules.</w:t>
+      </w:r>
+      <w:r>
+        <w:t xml:space="preserve"> </w:t>
+      </w:r>
+      <w:r>
+        <w:t xml:space="preserve">Read these in week one:</w:t>
+      </w:r>
+    </w:p>
+    <w:p>
+      <w:pPr>
+        <w:numPr>
+          <w:ilvl w:val="0"/>
+          <w:numId w:val="1001"/>
+        </w:numPr>
+        <w:pStyle w:val="Compact"/>
+      </w:pPr>
+      <w:r>
+        <w:t xml:space="preserve">What is said here stays here.</w:t>
+      </w:r>
+    </w:p>
+    <w:p>
+      <w:pPr>
+        <w:numPr>
+          <w:ilvl w:val="0"/>
+          <w:numId w:val="1001"/>
+        </w:numPr>
+        <w:pStyle w:val="Compact"/>
+      </w:pPr>
+      <w:r>
+        <w:t xml:space="preserve">No question is dumb. Most people were never taught this.</w:t>
+      </w:r>
+    </w:p>
+    <w:p>
+      <w:pPr>
+        <w:numPr>
+          <w:ilvl w:val="0"/>
+          <w:numId w:val="1001"/>
+        </w:numPr>
+        <w:pStyle w:val="Compact"/>
+      </w:pPr>
+      <w:r>
+        <w:t xml:space="preserve">No shame. We talk about money problems like normal problems.</w:t>
+      </w:r>
+    </w:p>
+    <w:p>
+      <w:pPr>
+        <w:numPr>
+          <w:ilvl w:val="0"/>
+          <w:numId w:val="1001"/>
+        </w:numPr>
+        <w:pStyle w:val="Compact"/>
+      </w:pPr>
+      <w:r>
+        <w:t xml:space="preserve">You can pass. You never have to share a personal number.</w:t>
       </w:r>
     </w:p>
     <w:p>
       <w:pPr>
         <w:pStyle w:val="Heading1"/>
       </w:pPr>
-      <w:bookmarkStart w:id="20" w:name="about-this-guide"/>
-      <w:r>
-        <w:t xml:space="preserve">About this guide</w:t>
-      </w:r>
-      <w:bookmarkEnd w:id="20"/>
+      <w:bookmarkStart w:id="21" w:name="how-to-use-the-program"/>
+      <w:r>
+        <w:t xml:space="preserve">How to use the program</w:t>
+      </w:r>
+      <w:bookmarkEnd w:id="21"/>
+    </w:p>
+    <w:p>
+      <w:pPr>
+        <w:numPr>
+          <w:ilvl w:val="0"/>
+          <w:numId w:val="1002"/>
+        </w:numPr>
+        <w:pStyle w:val="Compact"/>
+      </w:pPr>
+      <w:r>
+        <w:t xml:space="preserve">Six sessions, about 90 minutes each. You can compress to three longer sessions or stretch to twelve short ones.</w:t>
+      </w:r>
+    </w:p>
+    <w:p>
+      <w:pPr>
+        <w:numPr>
+          <w:ilvl w:val="0"/>
+          <w:numId w:val="1002"/>
+        </w:numPr>
+        <w:pStyle w:val="Compact"/>
+      </w:pPr>
+      <w:r>
+        <w:t xml:space="preserve">Each session follows the same shape: welcome, review, teach, practice, plan, close.</w:t>
+      </w:r>
+    </w:p>
+    <w:p>
+      <w:pPr>
+        <w:numPr>
+          <w:ilvl w:val="0"/>
+          <w:numId w:val="1002"/>
+        </w:numPr>
+        <w:pStyle w:val="Compact"/>
+      </w:pPr>
+      <w:r>
+        <w:t xml:space="preserve">Bring printed workbooks and pens. No internet is required.</w:t>
+      </w:r>
+    </w:p>
+    <w:p>
+      <w:pPr>
+        <w:numPr>
+          <w:ilvl w:val="0"/>
+          <w:numId w:val="1002"/>
+        </w:numPr>
+        <w:pStyle w:val="Compact"/>
+      </w:pPr>
+      <w:r>
+        <w:t xml:space="preserve">Give the pre-assessment in week one before you teach. Give the post-assessment at the end of week six. Collect the 90-day follow-up later if the site allows.</w:t>
+      </w:r>
     </w:p>
     <w:p>
       <w:pPr>
         <w:pStyle w:val="FirstParagraph"/>
       </w:pPr>
       <w:r>
-        <w:t xml:space="preserve">This guide helps you run the 6-week Banking and Credit Rebuilding program. You do not need to be a finance expert. You need to be prepared, honest, and respectful. The class is education, not financial, legal, or tax advice. Say that out loud in week one and any time someone asks for personal advice.</w:t>
-      </w:r>
-    </w:p>
-    <w:p>
-      <w:pPr>
-        <w:pStyle w:val="BodyText"/>
-      </w:pPr>
-      <w:r>
-        <w:t xml:space="preserve">This program is built from existing Financially Sovereign Academy lessons, adapted for returning citizens. Each week notes the source material so you can go deeper if you want.</w:t>
-      </w:r>
-    </w:p>
-    <w:p>
-      <w:pPr>
-        <w:pStyle w:val="BodyText"/>
-      </w:pPr>
-      <w:r>
-        <w:rPr>
-          <w:b/>
-        </w:rPr>
-        <w:t xml:space="preserve">Who should facilitate.</w:t>
-      </w:r>
-      <w:r>
-        <w:t xml:space="preserve"> </w:t>
-      </w:r>
-      <w:r>
-        <w:t xml:space="preserve">Ideally two people: one facilitator and one co-facilitator with lived reentry experience. Peer credibility helps people trust the room. (This is our working assumption, supported in general reentry practice.)</w:t>
-      </w:r>
-    </w:p>
-    <w:p>
-      <w:pPr>
-        <w:pStyle w:val="BodyText"/>
-      </w:pPr>
-      <w:r>
-        <w:rPr>
-          <w:b/>
-        </w:rPr>
-        <w:t xml:space="preserve">The room rules.</w:t>
-      </w:r>
-      <w:r>
-        <w:t xml:space="preserve"> </w:t>
-      </w:r>
-      <w:r>
-        <w:t xml:space="preserve">Read these in week one:</w:t>
-      </w:r>
-    </w:p>
-    <w:p>
-      <w:pPr>
-        <w:numPr>
-          <w:ilvl w:val="0"/>
-          <w:numId w:val="1001"/>
-        </w:numPr>
-        <w:pStyle w:val="Compact"/>
-      </w:pPr>
-      <w:r>
-        <w:t xml:space="preserve">What is said here stays here.</w:t>
-      </w:r>
-    </w:p>
-    <w:p>
-      <w:pPr>
-        <w:numPr>
-          <w:ilvl w:val="0"/>
-          <w:numId w:val="1001"/>
-        </w:numPr>
-        <w:pStyle w:val="Compact"/>
-      </w:pPr>
-      <w:r>
-        <w:t xml:space="preserve">No question is dumb. Most people were never taught this.</w:t>
-      </w:r>
-    </w:p>
-    <w:p>
-      <w:pPr>
-        <w:numPr>
-          <w:ilvl w:val="0"/>
-          <w:numId w:val="1001"/>
-        </w:numPr>
-        <w:pStyle w:val="Compact"/>
-      </w:pPr>
-      <w:r>
-        <w:t xml:space="preserve">No shame. We talk about money problems like normal problems.</w:t>
-      </w:r>
-    </w:p>
-    <w:p>
-      <w:pPr>
-        <w:numPr>
-          <w:ilvl w:val="0"/>
-          <w:numId w:val="1001"/>
-        </w:numPr>
-        <w:pStyle w:val="Compact"/>
-      </w:pPr>
-      <w:r>
-        <w:t xml:space="preserve">You can pass. You never have to share a personal number.</w:t>
-      </w:r>
-    </w:p>
-    <w:p>
-      <w:pPr>
-        <w:pStyle w:val="Heading1"/>
-      </w:pPr>
-      <w:bookmarkStart w:id="21" w:name="how-to-use-the-program"/>
-      <w:r>
-        <w:t xml:space="preserve">How to use the program</w:t>
-      </w:r>
-      <w:bookmarkEnd w:id="21"/>
-    </w:p>
-    <w:p>
-      <w:pPr>
-        <w:numPr>
-          <w:ilvl w:val="0"/>
-          <w:numId w:val="1002"/>
-        </w:numPr>
-        <w:pStyle w:val="Compact"/>
-      </w:pPr>
-      <w:r>
-        <w:t xml:space="preserve">Six sessions, about 90 minutes each. You can compress to three longer sessions or stretch to twelve short ones.</w:t>
-      </w:r>
-    </w:p>
-    <w:p>
-      <w:pPr>
-        <w:numPr>
-          <w:ilvl w:val="0"/>
-          <w:numId w:val="1002"/>
-        </w:numPr>
-        <w:pStyle w:val="Compact"/>
-      </w:pPr>
-      <w:r>
-        <w:t xml:space="preserve">Each session follows the same shape: welcome, review, teach, practice, plan, close.</w:t>
-      </w:r>
-    </w:p>
-    <w:p>
-      <w:pPr>
-        <w:numPr>
-          <w:ilvl w:val="0"/>
-          <w:numId w:val="1002"/>
-        </w:numPr>
-        <w:pStyle w:val="Compact"/>
-      </w:pPr>
-      <w:r>
-        <w:t xml:space="preserve">Bring printed workbooks and pens. No internet is required.</w:t>
-      </w:r>
-    </w:p>
-    <w:p>
-      <w:pPr>
-        <w:numPr>
-          <w:ilvl w:val="0"/>
-          <w:numId w:val="1002"/>
-        </w:numPr>
-        <w:pStyle w:val="Compact"/>
-      </w:pPr>
-      <w:r>
-        <w:t xml:space="preserve">Give the pre-assessment in week one before you teach. Give the post-assessment at the end of week six. Collect the 90-day follow-up later if the site allows.</w:t>
+        <w:rPr>
+          <w:b/>
+        </w:rPr>
+        <w:t xml:space="preserve">The session shape (use every week):</w:t>
+      </w:r>
+    </w:p>
+    <w:p>
+      <w:pPr>
+        <w:numPr>
+          <w:ilvl w:val="0"/>
+          <w:numId w:val="1003"/>
+        </w:numPr>
+        <w:pStyle w:val="Compact"/>
+      </w:pPr>
+      <w:r>
+        <w:t xml:space="preserve">Welcome and check-in (5 minutes)</w:t>
+      </w:r>
+    </w:p>
+    <w:p>
+      <w:pPr>
+        <w:numPr>
+          <w:ilvl w:val="0"/>
+          <w:numId w:val="1003"/>
+        </w:numPr>
+        <w:pStyle w:val="Compact"/>
+      </w:pPr>
+      <w:r>
+        <w:t xml:space="preserve">Review last week and answer questions (10 minutes)</w:t>
+      </w:r>
+    </w:p>
+    <w:p>
+      <w:pPr>
+        <w:numPr>
+          <w:ilvl w:val="0"/>
+          <w:numId w:val="1003"/>
+        </w:numPr>
+        <w:pStyle w:val="Compact"/>
+      </w:pPr>
+      <w:r>
+        <w:t xml:space="preserve">Teach the new topic in plain language (25 minutes)</w:t>
+      </w:r>
+    </w:p>
+    <w:p>
+      <w:pPr>
+        <w:numPr>
+          <w:ilvl w:val="0"/>
+          <w:numId w:val="1003"/>
+        </w:numPr>
+        <w:pStyle w:val="Compact"/>
+      </w:pPr>
+      <w:r>
+        <w:t xml:space="preserve">Practice with the workbook activity (30 minutes)</w:t>
+      </w:r>
+    </w:p>
+    <w:p>
+      <w:pPr>
+        <w:numPr>
+          <w:ilvl w:val="0"/>
+          <w:numId w:val="1003"/>
+        </w:numPr>
+        <w:pStyle w:val="Compact"/>
+      </w:pPr>
+      <w:r>
+        <w:t xml:space="preserve">Make a plan: one real step for this week (15 minutes)</w:t>
+      </w:r>
+    </w:p>
+    <w:p>
+      <w:pPr>
+        <w:numPr>
+          <w:ilvl w:val="0"/>
+          <w:numId w:val="1003"/>
+        </w:numPr>
+        <w:pStyle w:val="Compact"/>
+      </w:pPr>
+      <w:r>
+        <w:t xml:space="preserve">Close and preview next week (5 minutes)</w:t>
       </w:r>
     </w:p>
     <w:p>
@@ -244,96 +331,36 @@
         <w:rPr>
           <w:b/>
         </w:rPr>
-        <w:t xml:space="preserve">The session shape (use every week):</w:t>
-      </w:r>
-    </w:p>
-    <w:p>
-      <w:pPr>
-        <w:numPr>
-          <w:ilvl w:val="0"/>
-          <w:numId w:val="1003"/>
-        </w:numPr>
-        <w:pStyle w:val="Compact"/>
-      </w:pPr>
-      <w:r>
-        <w:t xml:space="preserve">Welcome and check-in (5 minutes)</w:t>
-      </w:r>
-    </w:p>
-    <w:p>
-      <w:pPr>
-        <w:numPr>
-          <w:ilvl w:val="0"/>
-          <w:numId w:val="1003"/>
-        </w:numPr>
-        <w:pStyle w:val="Compact"/>
-      </w:pPr>
-      <w:r>
-        <w:t xml:space="preserve">Review last week and answer questions (10 minutes)</w:t>
-      </w:r>
-    </w:p>
-    <w:p>
-      <w:pPr>
-        <w:numPr>
-          <w:ilvl w:val="0"/>
-          <w:numId w:val="1003"/>
-        </w:numPr>
-        <w:pStyle w:val="Compact"/>
-      </w:pPr>
-      <w:r>
-        <w:t xml:space="preserve">Teach the new topic in plain language (25 minutes)</w:t>
-      </w:r>
-    </w:p>
-    <w:p>
-      <w:pPr>
-        <w:numPr>
-          <w:ilvl w:val="0"/>
-          <w:numId w:val="1003"/>
-        </w:numPr>
-        <w:pStyle w:val="Compact"/>
-      </w:pPr>
-      <w:r>
-        <w:t xml:space="preserve">Practice with the workbook activity (30 minutes)</w:t>
-      </w:r>
-    </w:p>
-    <w:p>
-      <w:pPr>
-        <w:numPr>
-          <w:ilvl w:val="0"/>
-          <w:numId w:val="1003"/>
-        </w:numPr>
-        <w:pStyle w:val="Compact"/>
-      </w:pPr>
-      <w:r>
-        <w:t xml:space="preserve">Make a plan: one real step for this week (15 minutes)</w:t>
-      </w:r>
-    </w:p>
-    <w:p>
-      <w:pPr>
-        <w:numPr>
-          <w:ilvl w:val="0"/>
-          <w:numId w:val="1003"/>
-        </w:numPr>
-        <w:pStyle w:val="Compact"/>
-      </w:pPr>
-      <w:r>
-        <w:t xml:space="preserve">Close and preview next week (5 minutes)</w:t>
-      </w:r>
-    </w:p>
-    <w:p>
-      <w:pPr>
-        <w:pStyle w:val="FirstParagraph"/>
-      </w:pPr>
-      <w:r>
-        <w:rPr>
-          <w:b/>
-        </w:rPr>
         <w:t xml:space="preserve">Boundary script (memorize this):</w:t>
       </w:r>
       <w:r>
         <w:t xml:space="preserve"> </w:t>
       </w:r>
       <w:r>
-        <w:t xml:space="preserve">“I can teach how this works. I cannot tell you which bank to pick or promise you will get approved. For your personal situation, I will help you find a local partner who can sit down with you.”</w:t>
+        <w:t xml:space="preserve">“</w:t>
+      </w:r>
+      <w:r>
+        <w:t xml:space="preserve">I can teach how this works. I cannot tell you which bank to pick or promise you will get approved. For your personal situation, I will help you find a local partner who can sit down with you.</w:t>
+      </w:r>
+      <w:r>
+        <w:t xml:space="preserve">”</w:t>
+      </w:r>
+    </w:p>
+    <w:p>
+      <w:pPr>
+        <w:pStyle w:val="BodyText"/>
+      </w:pPr>
+      <w:r>
+        <w:rPr>
+          <w:b/>
+        </w:rPr>
+        <w:t xml:space="preserve">Resource Pack note:</w:t>
+      </w:r>
+      <w:r>
+        <w:t xml:space="preserve"> </w:t>
+      </w:r>
+      <w:r>
+        <w:t xml:space="preserve">A set of one-page handouts supports this program. The CFPB guide Your Money, Your Goals: Focus on Reentry is the facilitator spine. The handouts and the facilitator note live in the resource-pack folder. Hand out the learner sheets at the week shown below.</w:t>
       </w:r>
     </w:p>
     <w:p>
@@ -384,7 +411,25 @@
         <w:t xml:space="preserve"> </w:t>
       </w:r>
       <w:r>
-        <w:t xml:space="preserve">FSA “Banking Without Getting Robbed” (fees and FDIC sections).</w:t>
+        <w:t xml:space="preserve">FSA</w:t>
+      </w:r>
+      <w:r>
+        <w:t xml:space="preserve"> </w:t>
+      </w:r>
+      <w:r>
+        <w:t xml:space="preserve">“</w:t>
+      </w:r>
+      <w:r>
+        <w:t xml:space="preserve">Banking Without Getting Robbed</w:t>
+      </w:r>
+      <w:r>
+        <w:t xml:space="preserve">”</w:t>
+      </w:r>
+      <w:r>
+        <w:t xml:space="preserve"> </w:t>
+      </w:r>
+      <w:r>
+        <w:t xml:space="preserve">(fees and FDIC sections).</w:t>
       </w:r>
     </w:p>
     <w:p>
@@ -483,7 +528,13 @@
         <w:t xml:space="preserve"> </w:t>
       </w:r>
       <w:r>
-        <w:t xml:space="preserve">“Marcus cashes a $600 paycheck at a check casher every week. They take about $12 each time. That is about $48 a month and around $576 a year. With a free account and direct deposit, that money stays his.”</w:t>
+        <w:t xml:space="preserve">“</w:t>
+      </w:r>
+      <w:r>
+        <w:t xml:space="preserve">Marcus cashes a $600 paycheck at a check casher every week. They take about $12 each time. That is about $48 a month and around $576 a year. With a free account and direct deposit, that money stays his.</w:t>
+      </w:r>
+      <w:r>
+        <w:t xml:space="preserve">”</w:t>
       </w:r>
     </w:p>
     <w:p>
@@ -500,7 +551,25 @@
         <w:t xml:space="preserve"> </w:t>
       </w:r>
       <w:r>
-        <w:t xml:space="preserve">Workbook pages 1 to 4: “Cash vs account” cost comparison. Have people add up what cash-only living costs over a year.</w:t>
+        <w:t xml:space="preserve">Workbook pages 1 to 4:</w:t>
+      </w:r>
+      <w:r>
+        <w:t xml:space="preserve"> </w:t>
+      </w:r>
+      <w:r>
+        <w:t xml:space="preserve">“</w:t>
+      </w:r>
+      <w:r>
+        <w:t xml:space="preserve">Cash vs account</w:t>
+      </w:r>
+      <w:r>
+        <w:t xml:space="preserve">”</w:t>
+      </w:r>
+      <w:r>
+        <w:t xml:space="preserve"> </w:t>
+      </w:r>
+      <w:r>
+        <w:t xml:space="preserve">cost comparison. Have people add up what cash-only living costs over a year.</w:t>
       </w:r>
     </w:p>
     <w:p>
@@ -551,7 +620,19 @@
         <w:t xml:space="preserve"> </w:t>
       </w:r>
       <w:r>
-        <w:t xml:space="preserve">People who had a bad bank experience or owe a bank money. Do not argue. Say, “That is real, and next week we cover exactly that with second-chance accounts.”</w:t>
+        <w:t xml:space="preserve">People who had a bad bank experience or owe a bank money. Do not argue. Say,</w:t>
+      </w:r>
+      <w:r>
+        <w:t xml:space="preserve"> </w:t>
+      </w:r>
+      <w:r>
+        <w:t xml:space="preserve">“</w:t>
+      </w:r>
+      <w:r>
+        <w:t xml:space="preserve">That is real, and next week we cover exactly that with second-chance accounts.</w:t>
+      </w:r>
+      <w:r>
+        <w:t xml:space="preserve">”</w:t>
       </w:r>
     </w:p>
     <w:p>
@@ -602,7 +683,42 @@
         <w:t xml:space="preserve"> </w:t>
       </w:r>
       <w:r>
-        <w:t xml:space="preserve">FSA “Banking Without Getting Robbed” (second-chance accounts). New reentry content: banking with a record, getting ID.</w:t>
+        <w:t xml:space="preserve">FSA</w:t>
+      </w:r>
+      <w:r>
+        <w:t xml:space="preserve"> </w:t>
+      </w:r>
+      <w:r>
+        <w:t xml:space="preserve">“</w:t>
+      </w:r>
+      <w:r>
+        <w:t xml:space="preserve">Banking Without Getting Robbed</w:t>
+      </w:r>
+      <w:r>
+        <w:t xml:space="preserve">”</w:t>
+      </w:r>
+      <w:r>
+        <w:t xml:space="preserve"> </w:t>
+      </w:r>
+      <w:r>
+        <w:t xml:space="preserve">(second-chance accounts). New reentry content: banking with a record, getting ID.</w:t>
+      </w:r>
+    </w:p>
+    <w:p>
+      <w:pPr>
+        <w:pStyle w:val="BodyText"/>
+      </w:pPr>
+      <w:r>
+        <w:rPr>
+          <w:b/>
+        </w:rPr>
+        <w:t xml:space="preserve">Resource Pack note:</w:t>
+      </w:r>
+      <w:r>
+        <w:t xml:space="preserve"> </w:t>
+      </w:r>
+      <w:r>
+        <w:t xml:space="preserve">Hand out Open a Safe Account and If a Bank Says No as take-home sheets. Keep to information and referral. Do not promise approval, and do not say a denial can be reversed.</w:t>
       </w:r>
     </w:p>
     <w:p>
@@ -619,7 +735,19 @@
         <w:t xml:space="preserve"> </w:t>
       </w:r>
       <w:r>
-        <w:t xml:space="preserve">Check-in. Review week one. Ask, “What surprised you about the cost of cash?”</w:t>
+        <w:t xml:space="preserve">Check-in. Review week one. Ask,</w:t>
+      </w:r>
+      <w:r>
+        <w:t xml:space="preserve"> </w:t>
+      </w:r>
+      <w:r>
+        <w:t xml:space="preserve">“</w:t>
+      </w:r>
+      <w:r>
+        <w:t xml:space="preserve">What surprised you about the cost of cash?</w:t>
+      </w:r>
+      <w:r>
+        <w:t xml:space="preserve">”</w:t>
       </w:r>
     </w:p>
     <w:p>
@@ -814,7 +942,42 @@
         <w:t xml:space="preserve"> </w:t>
       </w:r>
       <w:r>
-        <w:t xml:space="preserve">FSA “Credit Scores Decoded” (5-factor breakdown, dispute process).</w:t>
+        <w:t xml:space="preserve">FSA</w:t>
+      </w:r>
+      <w:r>
+        <w:t xml:space="preserve"> </w:t>
+      </w:r>
+      <w:r>
+        <w:t xml:space="preserve">“</w:t>
+      </w:r>
+      <w:r>
+        <w:t xml:space="preserve">Credit Scores Decoded</w:t>
+      </w:r>
+      <w:r>
+        <w:t xml:space="preserve">”</w:t>
+      </w:r>
+      <w:r>
+        <w:t xml:space="preserve"> </w:t>
+      </w:r>
+      <w:r>
+        <w:t xml:space="preserve">(5-factor breakdown, dispute process).</w:t>
+      </w:r>
+    </w:p>
+    <w:p>
+      <w:pPr>
+        <w:pStyle w:val="BodyText"/>
+      </w:pPr>
+      <w:r>
+        <w:rPr>
+          <w:b/>
+        </w:rPr>
+        <w:t xml:space="preserve">Resource Pack note:</w:t>
+      </w:r>
+      <w:r>
+        <w:t xml:space="preserve"> </w:t>
+      </w:r>
+      <w:r>
+        <w:t xml:space="preserve">Get Your Free Credit Report and Dispute a Credit Report Error are after-release take-home sheets. In class, help learners plan, not pull reports. Pulling a report needs a private device or a mail request after release.</w:t>
       </w:r>
     </w:p>
     <w:p>
@@ -907,7 +1070,13 @@
         <w:t xml:space="preserve"> </w:t>
       </w:r>
       <w:r>
-        <w:t xml:space="preserve">“A score is like a phone battery. Late payments drain it. On-time payments charge it. It moves slowly, so small steady habits add up.”</w:t>
+        <w:t xml:space="preserve">“</w:t>
+      </w:r>
+      <w:r>
+        <w:t xml:space="preserve">A score is like a phone battery. Late payments drain it. On-time payments charge it. It moves slowly, so small steady habits add up.</w:t>
+      </w:r>
+      <w:r>
+        <w:t xml:space="preserve">”</w:t>
       </w:r>
     </w:p>
     <w:p>
@@ -1009,7 +1178,43 @@
         <w:t xml:space="preserve"> </w:t>
       </w:r>
       <w:r>
-        <w:t xml:space="preserve">FSA “Credit Scores Decoded” (secured cards); FSA “Consumer Protection” (scams).</w:t>
+        <w:t xml:space="preserve">FSA</w:t>
+      </w:r>
+      <w:r>
+        <w:t xml:space="preserve"> </w:t>
+      </w:r>
+      <w:r>
+        <w:t xml:space="preserve">“</w:t>
+      </w:r>
+      <w:r>
+        <w:t xml:space="preserve">Credit Scores Decoded</w:t>
+      </w:r>
+      <w:r>
+        <w:t xml:space="preserve">”</w:t>
+      </w:r>
+      <w:r>
+        <w:t xml:space="preserve"> </w:t>
+      </w:r>
+      <w:r>
+        <w:t xml:space="preserve">(secured cards); FSA</w:t>
+      </w:r>
+      <w:r>
+        <w:t xml:space="preserve"> </w:t>
+      </w:r>
+      <w:r>
+        <w:t xml:space="preserve">“</w:t>
+      </w:r>
+      <w:r>
+        <w:t xml:space="preserve">Consumer Protection</w:t>
+      </w:r>
+      <w:r>
+        <w:t xml:space="preserve">”</w:t>
+      </w:r>
+      <w:r>
+        <w:t xml:space="preserve"> </w:t>
+      </w:r>
+      <w:r>
+        <w:t xml:space="preserve">(scams).</w:t>
       </w:r>
     </w:p>
     <w:p>
@@ -1097,7 +1302,25 @@
         <w:pStyle w:val="Compact"/>
       </w:pPr>
       <w:r>
-        <w:t xml:space="preserve">Be patient. Avoid “credit repair” companies that promise fast fixes for a fee. Most things they do, you can do free.</w:t>
+        <w:t xml:space="preserve">Be patient. Avoid</w:t>
+      </w:r>
+      <w:r>
+        <w:t xml:space="preserve"> </w:t>
+      </w:r>
+      <w:r>
+        <w:t xml:space="preserve">“</w:t>
+      </w:r>
+      <w:r>
+        <w:t xml:space="preserve">credit repair</w:t>
+      </w:r>
+      <w:r>
+        <w:t xml:space="preserve">”</w:t>
+      </w:r>
+      <w:r>
+        <w:t xml:space="preserve"> </w:t>
+      </w:r>
+      <w:r>
+        <w:t xml:space="preserve">companies that promise fast fixes for a fee. Most things they do, you can do free.</w:t>
       </w:r>
     </w:p>
     <w:p>
@@ -1216,7 +1439,39 @@
         <w:t xml:space="preserve"> </w:t>
       </w:r>
       <w:r>
-        <w:t xml:space="preserve">FSA “Consumer Protection”; FSA Debt Payoff Calculator (light use). New reentry content: court debt and restitution.</w:t>
+        <w:t xml:space="preserve">FSA</w:t>
+      </w:r>
+      <w:r>
+        <w:t xml:space="preserve"> </w:t>
+      </w:r>
+      <w:r>
+        <w:t xml:space="preserve">“</w:t>
+      </w:r>
+      <w:r>
+        <w:t xml:space="preserve">Consumer Protection</w:t>
+      </w:r>
+      <w:r>
+        <w:t xml:space="preserve">”</w:t>
+      </w:r>
+      <w:r>
+        <w:t xml:space="preserve">; FSA Debt Payoff Calculator (light use). New reentry content: court debt and restitution.</w:t>
+      </w:r>
+    </w:p>
+    <w:p>
+      <w:pPr>
+        <w:pStyle w:val="BodyText"/>
+      </w:pPr>
+      <w:r>
+        <w:rPr>
+          <w:b/>
+        </w:rPr>
+        <w:t xml:space="preserve">Resource Pack note:</w:t>
+      </w:r>
+      <w:r>
+        <w:t xml:space="preserve"> </w:t>
+      </w:r>
+      <w:r>
+        <w:t xml:space="preserve">Hand out When a Debt Collector Contacts You. It explains rights and safe first steps. Do not advise whether to pay, settle, dispute, or ignore a debt. Route legal questions to legal aid, and use Find Local Help with 211 to locate it.</w:t>
       </w:r>
     </w:p>
     <w:p>
@@ -1428,7 +1683,42 @@
         <w:t xml:space="preserve"> </w:t>
       </w:r>
       <w:r>
-        <w:t xml:space="preserve">FSA “Financial Master Plan” structure, adapted.</w:t>
+        <w:t xml:space="preserve">FSA</w:t>
+      </w:r>
+      <w:r>
+        <w:t xml:space="preserve"> </w:t>
+      </w:r>
+      <w:r>
+        <w:t xml:space="preserve">“</w:t>
+      </w:r>
+      <w:r>
+        <w:t xml:space="preserve">Financial Master Plan</w:t>
+      </w:r>
+      <w:r>
+        <w:t xml:space="preserve">”</w:t>
+      </w:r>
+      <w:r>
+        <w:t xml:space="preserve"> </w:t>
+      </w:r>
+      <w:r>
+        <w:t xml:space="preserve">structure, adapted.</w:t>
+      </w:r>
+    </w:p>
+    <w:p>
+      <w:pPr>
+        <w:pStyle w:val="BodyText"/>
+      </w:pPr>
+      <w:r>
+        <w:rPr>
+          <w:b/>
+        </w:rPr>
+        <w:t xml:space="preserve">Resource Pack note:</w:t>
+      </w:r>
+      <w:r>
+        <w:t xml:space="preserve"> </w:t>
+      </w:r>
+      <w:r>
+        <w:t xml:space="preserve">Lead the Local Resource Map activity using Find Local Help with 211. Make sure each learner leaves with their take-home sheets together, as facility rules allow.</w:t>
       </w:r>
     </w:p>
     <w:p>
@@ -1509,7 +1799,25 @@
         <w:t xml:space="preserve"> </w:t>
       </w:r>
       <w:r>
-        <w:t xml:space="preserve">Workbook pages 29 to 32: complete the “Copy my plan” page. Each person fills in: my ID step, my account step, my one credit step, and one partner to contact. Pair-share the first step out loud.</w:t>
+        <w:t xml:space="preserve">Workbook pages 29 to 32: complete the</w:t>
+      </w:r>
+      <w:r>
+        <w:t xml:space="preserve"> </w:t>
+      </w:r>
+      <w:r>
+        <w:t xml:space="preserve">“</w:t>
+      </w:r>
+      <w:r>
+        <w:t xml:space="preserve">Copy my plan</w:t>
+      </w:r>
+      <w:r>
+        <w:t xml:space="preserve">”</w:t>
+      </w:r>
+      <w:r>
+        <w:t xml:space="preserve"> </w:t>
+      </w:r>
+      <w:r>
+        <w:t xml:space="preserve">page. Each person fills in: my ID step, my account step, my one credit step, and one partner to contact. Pair-share the first step out loud.</w:t>
       </w:r>
     </w:p>
     <w:p>
@@ -1572,7 +1880,19 @@
         <w:pStyle w:val="Compact"/>
       </w:pPr>
       <w:r>
-        <w:t xml:space="preserve">“Will I really be able to open an account?” Many people can, especially at credit unions and second-chance accounts. We cannot promise approval, but we will help you find a friendly partner.</w:t>
+        <w:t xml:space="preserve">“</w:t>
+      </w:r>
+      <w:r>
+        <w:t xml:space="preserve">Will I really be able to open an account?</w:t>
+      </w:r>
+      <w:r>
+        <w:t xml:space="preserve">”</w:t>
+      </w:r>
+      <w:r>
+        <w:t xml:space="preserve"> </w:t>
+      </w:r>
+      <w:r>
+        <w:t xml:space="preserve">Many people can, especially at credit unions and second-chance accounts. We cannot promise approval, but we will help you find a friendly partner.</w:t>
       </w:r>
     </w:p>
     <w:p>
@@ -1584,7 +1904,19 @@
         <w:pStyle w:val="Compact"/>
       </w:pPr>
       <w:r>
-        <w:t xml:space="preserve">“Can you fix my credit?” No one can erase true information. We teach the free steps that actually work over time.</w:t>
+        <w:t xml:space="preserve">“</w:t>
+      </w:r>
+      <w:r>
+        <w:t xml:space="preserve">Can you fix my credit?</w:t>
+      </w:r>
+      <w:r>
+        <w:t xml:space="preserve">”</w:t>
+      </w:r>
+      <w:r>
+        <w:t xml:space="preserve"> </w:t>
+      </w:r>
+      <w:r>
+        <w:t xml:space="preserve">No one can erase true information. We teach the free steps that actually work over time.</w:t>
       </w:r>
     </w:p>
     <w:p>
@@ -1596,7 +1928,19 @@
         <w:pStyle w:val="Compact"/>
       </w:pPr>
       <w:r>
-        <w:t xml:space="preserve">“What if I owe the court money I cannot pay?” Do not ignore it. Ask about a payment plan or review, and get free legal help. We will point you to it.</w:t>
+        <w:t xml:space="preserve">“</w:t>
+      </w:r>
+      <w:r>
+        <w:t xml:space="preserve">What if I owe the court money I cannot pay?</w:t>
+      </w:r>
+      <w:r>
+        <w:t xml:space="preserve">”</w:t>
+      </w:r>
+      <w:r>
+        <w:t xml:space="preserve"> </w:t>
+      </w:r>
+      <w:r>
+        <w:t xml:space="preserve">Do not ignore it. Ask about a payment plan or review, and get free legal help. We will point you to it.</w:t>
       </w:r>
     </w:p>
     <w:p>
@@ -1608,7 +1952,19 @@
         <w:pStyle w:val="Compact"/>
       </w:pPr>
       <w:r>
-        <w:t xml:space="preserve">“Is this financial advice?” No. This is education. For your personal plan, we connect you to a qualified partner.</w:t>
+        <w:t xml:space="preserve">“</w:t>
+      </w:r>
+      <w:r>
+        <w:t xml:space="preserve">Is this financial advice?</w:t>
+      </w:r>
+      <w:r>
+        <w:t xml:space="preserve">”</w:t>
+      </w:r>
+      <w:r>
+        <w:t xml:space="preserve"> </w:t>
+      </w:r>
+      <w:r>
+        <w:t xml:space="preserve">No. This is education. For your personal plan, we connect you to a qualified partner.</w:t>
       </w:r>
     </w:p>
     <w:p>
@@ -1691,27 +2047,6 @@
         </w:rPr>
         <w:t xml:space="preserve">Educational content only. Not financial, legal, or tax advice. Created by Dalia, Financially Sovereign Academy. Claims labeled per the Source and Claims Ledger.</w:t>
       </w:r>
-    </w:p>
-    <w:p>
-      <w:pPr>
-        <w:pStyle w:val="BodyText"/>
-      </w:pPr>
-      <w:r>
-        <w:t xml:space="preserve">Educational content only. Not financial, legal, or tax advice. Created by Dalia, Financially Sovereign Academy. Statistics are sourced or labeled per our Source and Claims record.</w:t>
-      </w:r>
-    </w:p>
-    <w:p>
-      <w:pPr>
-        <w:pStyle w:val="BodyText"/>
-      </w:pPr>
-      <w:hyperlink r:id="rId30">
-        <w:r>
-          <w:rPr>
-            <w:rStyle w:val="Hyperlink"/>
-          </w:rPr>
-          <w:t xml:space="preserve">Back to the program page</w:t>
-        </w:r>
-      </w:hyperlink>
     </w:p>
     <w:sectPr/>
   </w:body>
@@ -1949,7 +2284,7 @@
       </w:pPr>
     </w:lvl>
   </w:abstractNum>
-  <w:abstractNum w:abstractNumId="99401">
+  <w:abstractNum w:abstractNumId="99411">
     <w:nsid w:val="71315dca"/>
     <w:multiLevelType w:val="multilevel"/>
     <w:lvl w:ilvl="0">
@@ -2071,7 +2406,7 @@
     <w:abstractNumId w:val="991"/>
   </w:num>
   <w:num w:numId="1003">
-    <w:abstractNumId w:val="99401"/>
+    <w:abstractNumId w:val="99411"/>
     <w:lvlOverride w:ilvl="0">
       <w:startOverride w:val="1"/>
     </w:lvlOverride>

</xml_diff>